<commit_message>
Restructure essay around the shifts between registers
Co-Authored-By: Claude Opus 5.5 <noreply@anthropic.com>
Claude-Session: https://claude.ai/code/session_019uUXDw9QLbt94eTUQJdHen
</commit_message>
<xml_diff>
--- a/essays/chamberlain-broadcast-registers.docx
+++ b/essays/chamberlain-broadcast-registers.docx
@@ -7,10 +7,7 @@
         <w:jc w:val="center"/>
       </w:pPr>
       <w:r>
-        <w:rPr>
-          <w:i w:val="0"/>
-        </w:rPr>
-        <w:t>Grief, Procedure, Rite: The Three Voices of 3 September 1939</w:t>
+        <w:t>Mourner, Worker, Congregation: The Shifting Registers of 3 September 1939</w:t>
       </w:r>
     </w:p>
     <w:p>
@@ -18,10 +15,7 @@
         <w:ind w:firstLine="720"/>
       </w:pPr>
       <w:r>
-        <w:rPr>
-          <w:i w:val="0"/>
-        </w:rPr>
-        <w:t>At a quarter past eleven on the morning of Sunday, 3 September 1939, Neville Chamberlain told the British people that their country was at war with Germany. The broadcast is short, but it speaks in at least three voices. It opens as a tired man talking about his own failure, turns into a government reading out instructions, and closes in the language of church and crown. These shifts are not loose seams. Read in order, they show what the government believed the public needed on that morning. It did not think the nation had to be convinced that the war was right; it thought the nation had to be kept steady. The broadcast takes the listener from grief, to a task, to a sense of belonging. It first names the feeling, then turns that feeling into conduct, and at last places both inside a rite that asks nothing of the listener's judgment.</w:t>
+        <w:t>Neville Chamberlain's broadcast of 3 September 1939 does not speak in one voice. It begins as a private man's confession, turns abruptly into the language of government instruction, and ends in ceremony, with blessing, church bells, and "God Save the King." Each register on its own tells us something, but the turns between them tell us more, because each turn marks a judgment about the audience. The move from personal address to instruction shows that the government believed feeling had to be converted into conduct at once, before it could become panic. The move from instruction to ceremony shows that it believed conduct alone was not enough: people also had to feel that they belonged to something older and steadier than the crisis, and older than the man who had failed to prevent it. In sequence, the broadcast tells the British public what to hear, then what to do, then what to feel.</w:t>
       </w:r>
     </w:p>
     <w:p>
@@ -29,10 +23,7 @@
         <w:ind w:firstLine="720"/>
       </w:pPr>
       <w:r>
-        <w:rPr>
-          <w:i w:val="0"/>
-        </w:rPr>
-        <w:t>The personal register comes first, and it is striking how personal it is. Chamberlain begins with a place and a pronoun: “I am speaking to you from the Cabinet Room at 10 Downing Street.” After the formal account of the ultimatum, he turns to himself: “You can imagine what a bitter blow it is to me that all my long struggle to win peace has failed.” A head of government opens a world war by confessing defeat. That choice tells us whom the government thought it was addressing. This was a public that had cheered Munich less than a year before, that remembered the Somme, and that had not filled the streets with joy as crowds had in 1914. Such listeners would not trust a call to arms; they might trust a man who had plainly tried everything else. Chamberlain's line “I cannot believe that there is anything more or anything different that I could have done” defends his record, but it also absolves his audience. If he had done all he could, so had they. The pronoun soon widens to match: “We have a clear conscience.” Private grief becomes shared innocence. The man who had staked his name on peace becomes the most credible witness for war, because he is the most reluctant one: “He can only be stopped by force.” The flat, weary delivery, with no rhetorical lift, serves the same purpose. The government judged that the British people needed honesty of feeling, not excitement.</w:t>
+        <w:t>The personal register sets the starting point that the later shifts move away from. Chamberlain speaks "from the Cabinet Room at 10 Downing Street," and after the formal account of the ultimatum he turns to himself: "You can imagine what a bitter blow it is to me that all my long struggle to win peace has failed." This is the voice of a man, not a state. What the public needed to hear first, the government judged, was that war had not been chosen. Chamberlain insists he could have done nothing "more or anything different," places the blame on Hitler, who "can only be stopped by force," and widens "I" into "we": "We have a clear conscience." The listener is allowed to share his grief and his innocence. But grief is a dangerous place to leave a nation that expects to be bombed, and the broadcast does not leave it there for long.</w:t>
       </w:r>
     </w:p>
     <w:p>
@@ -40,10 +31,7 @@
         <w:ind w:firstLine="720"/>
       </w:pPr>
       <w:r>
-        <w:rPr>
-          <w:i w:val="0"/>
-        </w:rPr>
-        <w:t>The register then changes sharply. “The Government have made plans,” Chamberlain says, and the “I” disappears. The subject of the sentence is now an institution, and the grammar becomes that of a printed form: “You may be taking your part in the fighting services or as a volunteer in one of the branches of Civil Defence. If so you will report for duty in accordance with the instructions you have received.” The listener is sorted into categories and given a rule for each. Chamberlain then hands over the microphone to procedure itself: “When I have finished speaking certain detailed announcements will be made on behalf of the Government. Give these your closest attention.” The official announcements that followed dealt with air-raid sirens, the closing of places of entertainment, gas masks, and the danger of crowds. These are not stirring words, and they are not meant to be. The government expected bombers within hours; official planning in the late 1930s assumed mass casualties and feared mass panic. In that light the dull detail does emotional work. It shows that the state has a plan, and it gives each listener something to do with their fear. It is also notable how often the instruction is simply to carry on: people in factories, transport, and public services are told that “it is of vital importance that you should carry on with your jobs.” The government believed the public needed to feel useful and, above all, ordinary. Duty was offered as a cure for helplessness.</w:t>
+        <w:t>The first shift is the most revealing because of how it is made. The hinge is one sentence: "I know that you will all play your part with calmness and courage." It is still personal ("I know"), but its content is already a duty ("play your part") and an instruction about feeling ("calmness and courage"). A few lines later the speaker himself changes: "The Government have made plans." The "I" is gone, and so is the warm "you" of "You can imagine." In its place comes "you" sorted into categories, in the conditional grammar of an official form: "You may be taking your part in the fighting services... If so you will report for duty in accordance with the instructions you have received." Chamberlain then hands the listener on to procedure itself: "certain detailed announcements will be made on behalf of the Government. Give these your closest attention." In that order he lends his personal authority to the bureaucratic voice that follows, with its notices about air-raid sirens, closed places of entertainment, gas masks, and crowds. The speed of this turn is the message. The government did not think the public could be left to dwell on a sad old man's disappointment; official planners expected heavy bombing within hours and feared mass panic. Its answer was to give every listener something to do, and very often that something was to keep doing what they already did: "it is of vital importance that you should carry on with your jobs." The shift from personal to bureaucratic reveals a belief that the cure for fear was not inspiration but occupation. People needed to feel useful and ordinary, and the dull detail of the instructions was itself reassuring, since it showed that the state had a plan.</w:t>
       </w:r>
     </w:p>
     <w:p>
@@ -51,10 +39,7 @@
         <w:ind w:firstLine="720"/>
       </w:pPr>
       <w:r>
-        <w:rPr>
-          <w:i w:val="0"/>
-        </w:rPr>
-        <w:t>The third register begins before the music, inside Chamberlain's own closing words: “Now may God bless you all. May He defend the right.” The final sentence becomes a list with the rhythm of the prayer book: “brute force, bad faith, injustice, oppression and persecution.” Its promise, “the right will prevail,” is moral, not military. Nothing in the broadcast says how the war will be won, how long it will last, or what it will cost. The church bells and “God Save the King” then carry the listener past words altogether. On a Sunday morning, when many listeners had just come from church or would have been there, these sounds fit the shape of the day. Ceremony demands no reasoning; it offers continuity with institutions older than this government and this failure. That transfer matters. The broadcast began with a prime minister admitting that his policy had collapsed. It ends by handing the listener's loyalty to the Crown and to God, symbols that cannot fail in the same way. The man who could not keep the peace steps aside for the things the nation would actually fight for.</w:t>
+        <w:t>The second shift moves the other way, from the practical to the sacred, and it happens with equal abruptness. Directly after telling factory, transport, and utility workers to carry on with their jobs, Chamberlain says, "Now may God bless you all. May He defend the right." His closing sentence takes on the rhythm of a litany, "brute force, bad faith, injustice, oppression and persecution," and ends with a claim of faith, not strategy: "the right will prevail." When the broadcast turns fully to ceremony, with church bells and the national anthem, words stop doing the work. This shift shows what the instructions could not supply. A siren schedule tells people what to do; it does not tell them why, or whether the country will endure. Ceremony answers those questions without argument. On a Sunday morning, the bells joined the broadcast to the ordinary rhythm of the day, and the anthem gave listeners words they already knew and did not need to weigh. Ceremony also moved the listener's loyalty. The broadcast began with a prime minister admitting that his own policy had failed; it ends by directing loyalty to the King and to God, whose authority did not depend on the outcome of Munich. The shift from instruction to ceremony reveals a belief that the public needed to feel part of a continuous nation, one that had existed before this government and would exist after it.</w:t>
       </w:r>
     </w:p>
     <w:p>
@@ -62,10 +47,7 @@
         <w:ind w:firstLine="720"/>
       </w:pPr>
       <w:r>
-        <w:rPr>
-          <w:i w:val="0"/>
-        </w:rPr>
-        <w:t>Taken together, the three registers form a sequence of emotional management: admit the loss, assign the task, bind the community. What the broadcast leaves out is as revealing as what it includes. There is no triumph, no promise of a short war, no strategy, and no hatred of the German people; the enemy is “Hitler” and the “evil things” he stands for. The government plainly feared panic more than it feared defeatism. It believed the public needed four things: moral certainty that the war could not have been avoided, calm (“I know that you will all play your part with calmness and courage”), clear practical direction, and the reassurance that Britain itself, its church, its king, its Sunday morning, would continue. Yet the abrupt movement between voices also shows a state still searching for a wartime voice. A grieving man, a civil servant's checklist, and a hymn sit side by side without fully joining. Within a year, Churchill would fuse personal conviction, practical demand, and national ceremony into a single voice. On 3 September 1939 those voices still spoke one after the other, and the gaps between them record a government that knew what the public needed to feel, but had not yet learned how to make one speaker say it all.</w:t>
+        <w:t>What the pattern of shifts reveals, finally, is that the government addressed the public as three different audiences at once: as mourners who needed their grief acknowledged, as workers who needed orders, and as a congregation that needed to be held together. The registers are not blended into one voice; they follow each other, and in Chamberlain's closing lines they nearly collide, with a duty, a job list, and a blessing in quick succession. The seams show a state managing emotion step by step. Just as telling is what none of the three registers offers: triumph, hatred of the German people, a promise of a short war, or any account of how victory would be won. The government did not want the public excited, and it did not want it afraid. It wanted it calm, occupied, and sure of its place. On the day the war began, the shifts between these voices show a government that believed the British public needed to hear that the war was unavoidable, needed to be told exactly what to do next, and needed, above all, to feel that the nation would still be there tomorrow.</w:t>
       </w:r>
     </w:p>
     <w:p>
@@ -78,9 +60,6 @@
         <w:jc w:val="center"/>
       </w:pPr>
       <w:r>
-        <w:rPr>
-          <w:i w:val="0"/>
-        </w:rPr>
         <w:t>Work Cited</w:t>
       </w:r>
     </w:p>
@@ -89,9 +68,6 @@
         <w:ind w:left="720" w:hanging="720"/>
       </w:pPr>
       <w:r>
-        <w:rPr>
-          <w:i w:val="0"/>
-        </w:rPr>
         <w:t>Chamberlain, Neville. Broadcast declaring war on Germany. BBC, 3 Sept. 1939. BBC, www.bbc.com/videos/cv2z8p8zz9yo.</w:t>
       </w:r>
     </w:p>

</xml_diff>